<commit_message>
Add speaker image extracts and rebuild docs
</commit_message>
<xml_diff>
--- a/Form_B30_OA_application_form_July_2024.docx
+++ b/Form_B30_OA_application_form_July_2024.docx
@@ -2161,6 +2161,7 @@
               </w:tabs>
               <w:rPr>
                 <w:szCs w:val="22"/>
+                <w:lang w:val="en-GB"/>
               </w:rPr>
             </w:pPr>
             <w:r>
@@ -2190,54 +2191,6 @@
                 <w:szCs w:val="22"/>
               </w:rPr>
               <w:tab/>
-              <w:t>to</w:t>
-            </w:r>
-            <w:r>
-              <w:rPr>
-                <w:sz w:val="22"/>
-                <w:szCs w:val="22"/>
-              </w:rPr>
-              <w:t xml:space="preserve"> </w:t>
-            </w:r>
-            <w:r>
-              <w:rPr>
-                <w:sz w:val="22"/>
-                <w:szCs w:val="22"/>
-              </w:rPr>
-              <w:tab/>
-            </w:r>
-          </w:p>
-          <w:p>
-            <w:pPr>
-              <w:rPr>
-                <w:szCs w:val="22"/>
-                <w:lang w:val="en-GB"/>
-              </w:rPr>
-            </w:pPr>
-            <w:r>
-              <w:rPr>
-                <w:sz w:val="22"/>
-                <w:szCs w:val="22"/>
-                <w:lang w:val="en-GB"/>
-              </w:rPr>
-              <w:t>[Every</w:t>
-            </w:r>
-            <w:r>
-              <w:rPr>
-                <w:sz w:val="22"/>
-                <w:szCs w:val="22"/>
-                <w:lang w:val="en-GB"/>
-              </w:rPr>
-              <w:tab/>
-            </w:r>
-            <w:r>
-              <w:rPr>
-                <w:sz w:val="22"/>
-                <w:szCs w:val="22"/>
-                <w:lang w:val="en-GB"/>
-              </w:rPr>
-              <w:tab/>
-              <w:t xml:space="preserve">            (day of the week)]</w:t>
             </w:r>
           </w:p>
           <w:p>
@@ -5307,6 +5260,13 @@
                 <w:szCs w:val="22"/>
               </w:rPr>
               <w:t>Date:</w:t>
+            </w:r>
+            <w:r>
+              <w:rPr>
+                <w:sz w:val="22"/>
+                <w:szCs w:val="22"/>
+              </w:rPr>
+              <w:t xml:space="preserve"> 22/05/2026</w:t>
             </w:r>
             <w:r>
               <w:rPr>
@@ -10145,6 +10105,7 @@
   <w:style w:type="character" w:default="1" w:styleId="DefaultParagraphFont">
     <w:name w:val="Default Paragraph Font"/>
     <w:uiPriority w:val="1"/>
+    <w:semiHidden/>
     <w:unhideWhenUsed/>
   </w:style>
   <w:style w:type="table" w:default="1" w:styleId="TableNormal">

</xml_diff>